<commit_message>
Améliore la lettre : format, police et contenu
- Police changée en Calibri pour un rendu plus propre
- En-tête (émetteur/destinataire) reformaté sans bordures visibles
- Premier paragraphe enrichi : affiliation UCO, réseau ISFEC, petits
  effectifs, valeurs de l'enseignement catholique, mention 1er choix
- Suppression de tous les tirets cadratins (style IA)
- Correction de la relation UCO : affiliation, pas partenariat
- Programme : Master MEEF mention 1er degré (terminologie exacte)

https://claude.ai/code/session_01D5AvaZw46FsvmkTyhrXuzZ
</commit_message>
<xml_diff>
--- a/Lettre_motivation_ISFEC_Arradon_M2E.docx
+++ b/Lettre_motivation_ISFEC_Arradon_M2E.docx
@@ -4,9 +4,16 @@
   <w:body>
     <w:tbl>
       <w:tblPr>
-        <w:tblStyle w:val="TableGrid"/>
         <w:tblW w:type="auto" w:w="0"/>
         <w:tblLook w:firstColumn="1" w:firstRow="1" w:lastColumn="0" w:lastRow="0" w:noHBand="0" w:noVBand="1" w:val="04A0"/>
+        <w:tblBorders>
+          <w:top w:val="none" w:sz="0" w:space="0" w:color="auto"/>
+          <w:left w:val="none" w:sz="0" w:space="0" w:color="auto"/>
+          <w:bottom w:val="none" w:sz="0" w:space="0" w:color="auto"/>
+          <w:right w:val="none" w:sz="0" w:space="0" w:color="auto"/>
+          <w:insideH w:val="none" w:sz="0" w:space="0" w:color="auto"/>
+          <w:insideV w:val="none" w:sz="0" w:space="0" w:color="auto"/>
+        </w:tblBorders>
       </w:tblPr>
       <w:tblGrid>
         <w:gridCol w:w="4703"/>
@@ -15,37 +22,42 @@
       <w:tr>
         <w:tc>
           <w:tcPr>
-            <w:tcW w:type="dxa" w:w="4703"/>
+            <w:tcW w:w="4536" w:type="dxa"/>
             <w:tcBorders>
-              <w:top w:val="none"/>
-              <w:left w:val="none"/>
-              <w:bottom w:val="none"/>
-              <w:right w:val="none"/>
-              <w:insideH w:val="none"/>
-              <w:insideV w:val="none"/>
+              <w:top w:val="none" w:sz="0" w:space="0" w:color="auto"/>
+              <w:left w:val="none" w:sz="0" w:space="0" w:color="auto"/>
+              <w:bottom w:val="none" w:sz="0" w:space="0" w:color="auto"/>
+              <w:right w:val="none" w:sz="0" w:space="0" w:color="auto"/>
+              <w:insideH w:val="none" w:sz="0" w:space="0" w:color="auto"/>
+              <w:insideV w:val="none" w:sz="0" w:space="0" w:color="auto"/>
             </w:tcBorders>
+            <w:vAlign w:val="top"/>
           </w:tcPr>
           <w:p>
             <w:pPr>
-              <w:spacing w:before="0" w:after="40"/>
+              <w:spacing w:before="0" w:after="80"/>
+              <w:jc w:val="left"/>
             </w:pPr>
             <w:r>
               <w:rPr>
-                <w:rFonts w:ascii="Times New Roman" w:hAnsi="Times New Roman"/>
+                <w:rFonts w:ascii="Calibri" w:hAnsi="Calibri"/>
                 <w:b/>
+                <w:i w:val="0"/>
                 <w:sz w:val="24"/>
               </w:rPr>
-              <w:t>LOUIZA HADID</w:t>
+              <w:t>Louiza HADID</w:t>
             </w:r>
           </w:p>
           <w:p>
             <w:pPr>
               <w:spacing w:before="0" w:after="40"/>
+              <w:jc w:val="left"/>
             </w:pPr>
             <w:r>
               <w:rPr>
-                <w:rFonts w:ascii="Times New Roman" w:hAnsi="Times New Roman"/>
+                <w:rFonts w:ascii="Calibri" w:hAnsi="Calibri"/>
                 <w:b w:val="0"/>
+                <w:i w:val="0"/>
                 <w:sz w:val="22"/>
               </w:rPr>
               <w:t>3 rue de Ventspils</w:t>
@@ -54,11 +66,13 @@
           <w:p>
             <w:pPr>
               <w:spacing w:before="0" w:after="40"/>
+              <w:jc w:val="left"/>
             </w:pPr>
             <w:r>
               <w:rPr>
-                <w:rFonts w:ascii="Times New Roman" w:hAnsi="Times New Roman"/>
+                <w:rFonts w:ascii="Calibri" w:hAnsi="Calibri"/>
                 <w:b w:val="0"/>
+                <w:i w:val="0"/>
                 <w:sz w:val="22"/>
               </w:rPr>
               <w:t>56100 Lorient</w:t>
@@ -67,11 +81,13 @@
           <w:p>
             <w:pPr>
               <w:spacing w:before="0" w:after="40"/>
+              <w:jc w:val="left"/>
             </w:pPr>
             <w:r>
               <w:rPr>
-                <w:rFonts w:ascii="Times New Roman" w:hAnsi="Times New Roman"/>
+                <w:rFonts w:ascii="Calibri" w:hAnsi="Calibri"/>
                 <w:b w:val="0"/>
+                <w:i w:val="0"/>
                 <w:sz w:val="22"/>
               </w:rPr>
               <w:t>(+33) 6 50 37 56 47</w:t>
@@ -80,11 +96,13 @@
           <w:p>
             <w:pPr>
               <w:spacing w:before="0" w:after="40"/>
+              <w:jc w:val="left"/>
             </w:pPr>
             <w:r>
               <w:rPr>
-                <w:rFonts w:ascii="Times New Roman" w:hAnsi="Times New Roman"/>
+                <w:rFonts w:ascii="Calibri" w:hAnsi="Calibri"/>
                 <w:b w:val="0"/>
+                <w:i w:val="0"/>
                 <w:sz w:val="22"/>
               </w:rPr>
               <w:t>louizahdd@gmail.com</w:t>
@@ -93,53 +111,57 @@
         </w:tc>
         <w:tc>
           <w:tcPr>
-            <w:tcW w:type="dxa" w:w="4703"/>
+            <w:tcW w:w="4536" w:type="dxa"/>
             <w:tcBorders>
-              <w:top w:val="none"/>
-              <w:left w:val="none"/>
-              <w:bottom w:val="none"/>
-              <w:right w:val="none"/>
-              <w:insideH w:val="none"/>
-              <w:insideV w:val="none"/>
+              <w:top w:val="none" w:sz="0" w:space="0" w:color="auto"/>
+              <w:left w:val="none" w:sz="0" w:space="0" w:color="auto"/>
+              <w:bottom w:val="none" w:sz="0" w:space="0" w:color="auto"/>
+              <w:right w:val="none" w:sz="0" w:space="0" w:color="auto"/>
+              <w:insideH w:val="none" w:sz="0" w:space="0" w:color="auto"/>
+              <w:insideV w:val="none" w:sz="0" w:space="0" w:color="auto"/>
             </w:tcBorders>
+            <w:vAlign w:val="top"/>
           </w:tcPr>
           <w:p>
             <w:pPr>
-              <w:spacing w:before="0" w:after="40"/>
-              <w:jc w:val="right"/>
+              <w:spacing w:before="0" w:after="60"/>
+              <w:jc w:val="left"/>
             </w:pPr>
             <w:r>
               <w:rPr>
-                <w:rFonts w:ascii="Times New Roman" w:hAnsi="Times New Roman"/>
-                <w:b w:val="0"/>
+                <w:rFonts w:ascii="Calibri" w:hAnsi="Calibri"/>
+                <w:b/>
+                <w:i w:val="0"/>
                 <w:sz w:val="22"/>
               </w:rPr>
-              <w:t>Madame la Directrice / Monsieur le Directeur</w:t>
+              <w:t>ISFEC Bretagne</w:t>
             </w:r>
           </w:p>
           <w:p>
             <w:pPr>
               <w:spacing w:before="0" w:after="40"/>
-              <w:jc w:val="right"/>
+              <w:jc w:val="left"/>
             </w:pPr>
             <w:r>
               <w:rPr>
-                <w:rFonts w:ascii="Times New Roman" w:hAnsi="Times New Roman"/>
+                <w:rFonts w:ascii="Calibri" w:hAnsi="Calibri"/>
                 <w:b w:val="0"/>
+                <w:i w:val="0"/>
                 <w:sz w:val="22"/>
               </w:rPr>
-              <w:t>ISFEC Bretagne – Site d'Arradon</w:t>
+              <w:t>Site d'Arradon</w:t>
             </w:r>
           </w:p>
           <w:p>
             <w:pPr>
               <w:spacing w:before="0" w:after="40"/>
-              <w:jc w:val="right"/>
+              <w:jc w:val="left"/>
             </w:pPr>
             <w:r>
               <w:rPr>
-                <w:rFonts w:ascii="Times New Roman" w:hAnsi="Times New Roman"/>
+                <w:rFonts w:ascii="Calibri" w:hAnsi="Calibri"/>
                 <w:b w:val="0"/>
+                <w:i w:val="0"/>
                 <w:sz w:val="22"/>
               </w:rPr>
               <w:t>3 allée des Fougères, BP 25</w:t>
@@ -148,12 +170,13 @@
           <w:p>
             <w:pPr>
               <w:spacing w:before="0" w:after="40"/>
-              <w:jc w:val="right"/>
+              <w:jc w:val="left"/>
             </w:pPr>
             <w:r>
               <w:rPr>
-                <w:rFonts w:ascii="Times New Roman" w:hAnsi="Times New Roman"/>
+                <w:rFonts w:ascii="Calibri" w:hAnsi="Calibri"/>
                 <w:b w:val="0"/>
+                <w:i w:val="0"/>
                 <w:sz w:val="22"/>
               </w:rPr>
               <w:t>56610 Arradon</w:t>
@@ -164,18 +187,18 @@
     </w:tbl>
     <w:p>
       <w:pPr>
-        <w:spacing w:before="160" w:after="0"/>
+        <w:spacing w:before="200" w:after="0"/>
         <w:jc w:val="left"/>
       </w:pPr>
     </w:p>
     <w:p>
       <w:pPr>
-        <w:spacing w:before="80" w:after="240"/>
+        <w:spacing w:before="40" w:after="280"/>
         <w:jc w:val="right"/>
       </w:pPr>
       <w:r>
         <w:rPr>
-          <w:rFonts w:ascii="Times New Roman" w:hAnsi="Times New Roman"/>
+          <w:rFonts w:ascii="Calibri" w:hAnsi="Calibri"/>
           <w:b w:val="0"/>
           <w:i w:val="0"/>
           <w:sz w:val="22"/>
@@ -189,29 +212,31 @@
       </w:pPr>
       <w:r>
         <w:rPr>
-          <w:rFonts w:ascii="Times New Roman" w:hAnsi="Times New Roman"/>
+          <w:rFonts w:ascii="Calibri" w:hAnsi="Calibri"/>
           <w:b/>
+          <w:i w:val="0"/>
           <w:sz w:val="22"/>
         </w:rPr>
         <w:t xml:space="preserve">Objet : </w:t>
       </w:r>
       <w:r>
         <w:rPr>
-          <w:rFonts w:ascii="Times New Roman" w:hAnsi="Times New Roman"/>
+          <w:rFonts w:ascii="Calibri" w:hAnsi="Calibri"/>
           <w:b/>
+          <w:i w:val="0"/>
           <w:sz w:val="22"/>
         </w:rPr>
-        <w:t>Candidature au Master M2E – Mention 1ᵉʳ degré</w:t>
+        <w:t>Candidature au Master MEEF – Mention 1er degré</w:t>
       </w:r>
     </w:p>
     <w:p>
       <w:pPr>
-        <w:spacing w:before="0" w:after="200"/>
+        <w:spacing w:before="0" w:after="240"/>
         <w:jc w:val="left"/>
       </w:pPr>
       <w:r>
         <w:rPr>
-          <w:rFonts w:ascii="Times New Roman" w:hAnsi="Times New Roman"/>
+          <w:rFonts w:ascii="Calibri" w:hAnsi="Calibri"/>
           <w:b w:val="0"/>
           <w:i w:val="0"/>
           <w:sz w:val="22"/>
@@ -227,11 +252,12 @@
       </w:pPr>
       <w:r>
         <w:rPr>
-          <w:rFonts w:ascii="Times New Roman" w:hAnsi="Times New Roman"/>
+          <w:rFonts w:ascii="Calibri" w:hAnsi="Calibri"/>
           <w:b w:val="0"/>
+          <w:i w:val="0"/>
           <w:sz w:val="22"/>
         </w:rPr>
-        <w:t>Titulaire d'une licence en Sciences de l'éducation obtenue à l'Université Rennes 2, je me permets de vous adresser ma candidature pour intégrer le Master M2E, mention 1ᵉʳ degré, proposé par l'ISFEC d'Arradon. Cet établissement représente mon premier choix de formation, en raison de la qualité de l'accompagnement qu'il offre et de son partenariat avec l'Université Catholique de l'Ouest, qui me semble particulièrement adapté à mon projet professionnel : devenir professeure des écoles.</w:t>
+        <w:t>C'est avec un vif intérêt que je vous adresse ma candidature pour le Master MEEF, mention 1er degré, proposé par l'ISFEC Bretagne sur son site d'Arradon. Affilié à l'Université Catholique de l'Ouest pour la délivrance du diplôme, cet établissement s'inscrit pleinement dans le réseau national des ISFEC et se distingue par un accompagnement de proximité au sein de promotions à effectifs réduits. C'est ce cadre de formation, à la fois rigoureux et bienveillant, ancré dans les valeurs de l'enseignement catholique, qui en fait mon premier choix dans la perspective de préparer le CRPE et d'enseigner dans le premier degré.</w:t>
       </w:r>
     </w:p>
     <w:p>
@@ -242,11 +268,12 @@
       </w:pPr>
       <w:r>
         <w:rPr>
-          <w:rFonts w:ascii="Times New Roman" w:hAnsi="Times New Roman"/>
+          <w:rFonts w:ascii="Calibri" w:hAnsi="Calibri"/>
           <w:b w:val="0"/>
+          <w:i w:val="0"/>
           <w:sz w:val="22"/>
         </w:rPr>
-        <w:t>Mon parcours en Sciences de l'éducation m'a permis de construire des bases solides en pédagogie, en psychologie du développement et en didactique. Ces apprentissages ont progressivement orienté ma réflexion vers l'enseignement du premier degré, un milieu dans lequel je me projette avec conviction. La préparation au CRPE intégrée à votre Master M2E constitue pour moi une étape décisive pour accéder à ce métier dans les meilleures conditions.</w:t>
+        <w:t>Mon parcours en Sciences de l'éducation à l'Université Rennes 2 m'a permis de construire des bases solides en pédagogie, en psychologie du développement et en didactique. Ces apprentissages ont progressivement conforté ma conviction : c'est dans l'enseignement du premier degré que je veux m'investir sur le long terme. La préparation au CRPE intégrée à votre Master constitue pour moi une étape décisive pour accéder à ce métier dans les meilleures conditions.</w:t>
       </w:r>
     </w:p>
     <w:p>
@@ -257,11 +284,12 @@
       </w:pPr>
       <w:r>
         <w:rPr>
-          <w:rFonts w:ascii="Times New Roman" w:hAnsi="Times New Roman"/>
+          <w:rFonts w:ascii="Calibri" w:hAnsi="Calibri"/>
           <w:b w:val="0"/>
+          <w:i w:val="0"/>
           <w:sz w:val="22"/>
         </w:rPr>
-        <w:t>Sur le plan pratique, mes expériences au contact des enfants et des apprenants ont renforcé cette orientation. En tant qu'animatrice périscolaire dans le quartier prioritaire de Villejean à Rennes, j'ai appris à m'adapter à des publics diversifiés et à faire preuve de patience et de bienveillance dans des situations parfois complexes. J'ai également exercé comme tutrice de français auprès d'apprenants étrangers, une expérience qui m'a amenée à travailler la reformulation, la différenciation pédagogique et l'écoute active — des compétences directement transposables dans l'exercice du métier d'enseignante.</w:t>
+        <w:t>Sur le plan pratique, mes expériences au contact des enfants ont renforcé cette orientation. En tant qu'animatrice périscolaire dans le quartier prioritaire de Villejean à Rennes, j'ai appris à adapter mon approche à des publics diversifiés et à faire preuve de patience et de bienveillance dans des situations parfois complexes. J'ai également exercé comme tutrice de français auprès d'apprenants étrangers, ce qui m'a amenée à travailler la reformulation, la différenciation pédagogique et l'écoute active, des compétences directement transposables dans l'exercice du métier d'enseignante.</w:t>
       </w:r>
     </w:p>
     <w:p>
@@ -272,21 +300,22 @@
       </w:pPr>
       <w:r>
         <w:rPr>
-          <w:rFonts w:ascii="Times New Roman" w:hAnsi="Times New Roman"/>
+          <w:rFonts w:ascii="Calibri" w:hAnsi="Calibri"/>
           <w:b w:val="0"/>
+          <w:i w:val="0"/>
           <w:sz w:val="22"/>
         </w:rPr>
-        <w:t>Ces expériences m'ont confirmé que l'enseignement va bien au-delà de la simple transmission de savoirs : il s'agit d'accompagner des élèves dans leur développement, de les encourager et d'adapter sa pratique à leurs besoins. C'est dans cette perspective que je souhaite m'investir pleinement dans votre formation, convaincue que l'ISFEC d'Arradon m'apportera les ressources théoriques et pratiques nécessaires pour exercer ce métier avec rigueur et engagement.</w:t>
+        <w:t>Ces expériences m'ont confirmé que l'enseignement va bien au-delà de la transmission de savoirs : il s'agit avant tout d'accompagner chaque élève dans son développement, de l'encourager et d'adapter sa pratique à ses besoins. C'est dans cette perspective que je souhaite m'investir pleinement dans votre formation, convaincue que l'ISFEC d'Arradon m'offrira les outils théoriques et pratiques pour exercer ce métier avec rigueur et engagement.</w:t>
       </w:r>
     </w:p>
     <w:p>
       <w:pPr>
-        <w:spacing w:before="80" w:after="200"/>
+        <w:spacing w:before="0" w:after="200"/>
         <w:jc w:val="both"/>
       </w:pPr>
       <w:r>
         <w:rPr>
-          <w:rFonts w:ascii="Times New Roman" w:hAnsi="Times New Roman"/>
+          <w:rFonts w:ascii="Calibri" w:hAnsi="Calibri"/>
           <w:b w:val="0"/>
           <w:i w:val="0"/>
           <w:sz w:val="22"/>
@@ -301,7 +330,7 @@
       </w:pPr>
       <w:r>
         <w:rPr>
-          <w:rFonts w:ascii="Times New Roman" w:hAnsi="Times New Roman"/>
+          <w:rFonts w:ascii="Calibri" w:hAnsi="Calibri"/>
           <w:b w:val="0"/>
           <w:i w:val="0"/>
           <w:sz w:val="22"/>
@@ -316,7 +345,7 @@
       </w:pPr>
       <w:r>
         <w:rPr>
-          <w:rFonts w:ascii="Times New Roman" w:hAnsi="Times New Roman"/>
+          <w:rFonts w:ascii="Calibri" w:hAnsi="Calibri"/>
           <w:b/>
           <w:i w:val="0"/>
           <w:sz w:val="22"/>
@@ -697,6 +726,13 @@
     <w:name w:val="Normal"/>
     <w:qFormat/>
     <w:rsid w:val="00FC693F"/>
+    <w:pPr>
+      <w:spacing w:before="0" w:after="0" w:line="280" w:lineRule="exact"/>
+    </w:pPr>
+    <w:rPr>
+      <w:rFonts w:ascii="Calibri" w:hAnsi="Calibri"/>
+      <w:sz w:val="22"/>
+    </w:rPr>
   </w:style>
   <w:style w:type="paragraph" w:styleId="Header">
     <w:name w:val="header"/>

</xml_diff>

<commit_message>
Redesign complet de la lettre : aération, alignement, logo
Mise en page :
- Nom de l'expéditrice en bleu ISFEC (15pt, gras) pour le repérage visuel
- Ligne de séparation bleue entre en-tête et corps
- Destinataire + date sur la même ligne (table sans bordures propre)
- Espacement généreux entre toutes les sections
- Support logo ISFEC : insertion automatique si isfec_logo.png présent,
  sinon placeholder visible avec instructions dans la console
- Paragraphes du corps : interligne aéré (sa=12), justifié, avec retrait

https://claude.ai/code/session_01D5AvaZw46FsvmkTyhrXuzZ
</commit_message>
<xml_diff>
--- a/Lettre_motivation_ISFEC_Arradon_M2E.docx
+++ b/Lettre_motivation_ISFEC_Arradon_M2E.docx
@@ -22,7 +22,6 @@
       <w:tr>
         <w:tc>
           <w:tcPr>
-            <w:tcW w:w="4536" w:type="dxa"/>
             <w:tcBorders>
               <w:top w:val="none" w:sz="0" w:space="0" w:color="auto"/>
               <w:left w:val="none" w:sz="0" w:space="0" w:color="auto"/>
@@ -32,10 +31,11 @@
               <w:insideV w:val="none" w:sz="0" w:space="0" w:color="auto"/>
             </w:tcBorders>
             <w:vAlign w:val="top"/>
+            <w:tcW w:w="5670" w:type="dxa"/>
           </w:tcPr>
           <w:p>
             <w:pPr>
-              <w:spacing w:before="0" w:after="80"/>
+              <w:spacing w:before="0" w:after="100"/>
               <w:jc w:val="left"/>
             </w:pPr>
             <w:r>
@@ -43,14 +43,15 @@
                 <w:rFonts w:ascii="Calibri" w:hAnsi="Calibri"/>
                 <w:b/>
                 <w:i w:val="0"/>
-                <w:sz w:val="24"/>
+                <w:color w:val="1B548C"/>
+                <w:sz w:val="30"/>
               </w:rPr>
               <w:t>Louiza HADID</w:t>
             </w:r>
           </w:p>
           <w:p>
             <w:pPr>
-              <w:spacing w:before="0" w:after="40"/>
+              <w:spacing w:before="0" w:after="20"/>
               <w:jc w:val="left"/>
             </w:pPr>
             <w:r>
@@ -58,14 +59,14 @@
                 <w:rFonts w:ascii="Calibri" w:hAnsi="Calibri"/>
                 <w:b w:val="0"/>
                 <w:i w:val="0"/>
-                <w:sz w:val="22"/>
+                <w:sz w:val="20"/>
               </w:rPr>
               <w:t>3 rue de Ventspils</w:t>
             </w:r>
           </w:p>
           <w:p>
             <w:pPr>
-              <w:spacing w:before="0" w:after="40"/>
+              <w:spacing w:before="0" w:after="20"/>
               <w:jc w:val="left"/>
             </w:pPr>
             <w:r>
@@ -73,14 +74,14 @@
                 <w:rFonts w:ascii="Calibri" w:hAnsi="Calibri"/>
                 <w:b w:val="0"/>
                 <w:i w:val="0"/>
-                <w:sz w:val="22"/>
+                <w:sz w:val="20"/>
               </w:rPr>
               <w:t>56100 Lorient</w:t>
             </w:r>
           </w:p>
           <w:p>
             <w:pPr>
-              <w:spacing w:before="0" w:after="40"/>
+              <w:spacing w:before="0" w:after="20"/>
               <w:jc w:val="left"/>
             </w:pPr>
             <w:r>
@@ -88,14 +89,14 @@
                 <w:rFonts w:ascii="Calibri" w:hAnsi="Calibri"/>
                 <w:b w:val="0"/>
                 <w:i w:val="0"/>
-                <w:sz w:val="22"/>
+                <w:sz w:val="20"/>
               </w:rPr>
               <w:t>(+33) 6 50 37 56 47</w:t>
             </w:r>
           </w:p>
           <w:p>
             <w:pPr>
-              <w:spacing w:before="0" w:after="40"/>
+              <w:spacing w:before="0" w:after="0"/>
               <w:jc w:val="left"/>
             </w:pPr>
             <w:r>
@@ -103,7 +104,7 @@
                 <w:rFonts w:ascii="Calibri" w:hAnsi="Calibri"/>
                 <w:b w:val="0"/>
                 <w:i w:val="0"/>
-                <w:sz w:val="22"/>
+                <w:sz w:val="20"/>
               </w:rPr>
               <w:t>louizahdd@gmail.com</w:t>
             </w:r>
@@ -111,7 +112,6 @@
         </w:tc>
         <w:tc>
           <w:tcPr>
-            <w:tcW w:w="4536" w:type="dxa"/>
             <w:tcBorders>
               <w:top w:val="none" w:sz="0" w:space="0" w:color="auto"/>
               <w:left w:val="none" w:sz="0" w:space="0" w:color="auto"/>
@@ -121,10 +121,69 @@
               <w:insideV w:val="none" w:sz="0" w:space="0" w:color="auto"/>
             </w:tcBorders>
             <w:vAlign w:val="top"/>
+            <w:tcW w:w="3402" w:type="dxa"/>
           </w:tcPr>
           <w:p>
             <w:pPr>
-              <w:spacing w:before="0" w:after="60"/>
+              <w:spacing w:before="0"/>
+              <w:jc w:val="right"/>
+            </w:pPr>
+            <w:r>
+              <w:rPr>
+                <w:rFonts w:ascii="Calibri" w:hAnsi="Calibri"/>
+                <w:b w:val="0"/>
+                <w:i/>
+                <w:color w:val="BBBBBB"/>
+                <w:sz w:val="18"/>
+              </w:rPr>
+              <w:t>[ Logo ISFEC Bretagne ]</w:t>
+            </w:r>
+          </w:p>
+        </w:tc>
+      </w:tr>
+    </w:tbl>
+    <w:p>
+      <w:pPr>
+        <w:spacing w:before="320" w:after="320"/>
+        <w:pBdr>
+          <w:bottom w:val="single" w:sz="6" w:space="1" w:color="1B548C"/>
+        </w:pBdr>
+      </w:pPr>
+    </w:p>
+    <w:tbl>
+      <w:tblPr>
+        <w:tblW w:type="auto" w:w="0"/>
+        <w:tblLook w:firstColumn="1" w:firstRow="1" w:lastColumn="0" w:lastRow="0" w:noHBand="0" w:noVBand="1" w:val="04A0"/>
+        <w:tblBorders>
+          <w:top w:val="none" w:sz="0" w:space="0" w:color="auto"/>
+          <w:left w:val="none" w:sz="0" w:space="0" w:color="auto"/>
+          <w:bottom w:val="none" w:sz="0" w:space="0" w:color="auto"/>
+          <w:right w:val="none" w:sz="0" w:space="0" w:color="auto"/>
+          <w:insideH w:val="none" w:sz="0" w:space="0" w:color="auto"/>
+          <w:insideV w:val="none" w:sz="0" w:space="0" w:color="auto"/>
+        </w:tblBorders>
+      </w:tblPr>
+      <w:tblGrid>
+        <w:gridCol w:w="4703"/>
+        <w:gridCol w:w="4703"/>
+      </w:tblGrid>
+      <w:tr>
+        <w:tc>
+          <w:tcPr>
+            <w:tcBorders>
+              <w:top w:val="none" w:sz="0" w:space="0" w:color="auto"/>
+              <w:left w:val="none" w:sz="0" w:space="0" w:color="auto"/>
+              <w:bottom w:val="none" w:sz="0" w:space="0" w:color="auto"/>
+              <w:right w:val="none" w:sz="0" w:space="0" w:color="auto"/>
+              <w:insideH w:val="none" w:sz="0" w:space="0" w:color="auto"/>
+              <w:insideV w:val="none" w:sz="0" w:space="0" w:color="auto"/>
+            </w:tcBorders>
+            <w:vAlign w:val="top"/>
+            <w:tcW w:w="5386" w:type="dxa"/>
+          </w:tcPr>
+          <w:p>
+            <w:pPr>
+              <w:spacing w:before="0" w:after="40"/>
               <w:jc w:val="left"/>
             </w:pPr>
             <w:r>
@@ -169,7 +228,7 @@
           </w:p>
           <w:p>
             <w:pPr>
-              <w:spacing w:before="0" w:after="40"/>
+              <w:spacing w:before="0" w:after="0"/>
               <w:jc w:val="left"/>
             </w:pPr>
             <w:r>
@@ -183,32 +242,46 @@
             </w:r>
           </w:p>
         </w:tc>
+        <w:tc>
+          <w:tcPr>
+            <w:tcBorders>
+              <w:top w:val="none" w:sz="0" w:space="0" w:color="auto"/>
+              <w:left w:val="none" w:sz="0" w:space="0" w:color="auto"/>
+              <w:bottom w:val="none" w:sz="0" w:space="0" w:color="auto"/>
+              <w:right w:val="none" w:sz="0" w:space="0" w:color="auto"/>
+              <w:insideH w:val="none" w:sz="0" w:space="0" w:color="auto"/>
+              <w:insideV w:val="none" w:sz="0" w:space="0" w:color="auto"/>
+            </w:tcBorders>
+            <w:vAlign w:val="top"/>
+            <w:tcW w:w="3685" w:type="dxa"/>
+          </w:tcPr>
+          <w:p>
+            <w:pPr>
+              <w:spacing w:before="0" w:after="0"/>
+              <w:jc w:val="right"/>
+            </w:pPr>
+            <w:r>
+              <w:rPr>
+                <w:rFonts w:ascii="Calibri" w:hAnsi="Calibri"/>
+                <w:b w:val="0"/>
+                <w:i w:val="0"/>
+                <w:sz w:val="22"/>
+              </w:rPr>
+              <w:t>Lorient, le 1er mars 2026</w:t>
+            </w:r>
+          </w:p>
+        </w:tc>
       </w:tr>
     </w:tbl>
     <w:p>
       <w:pPr>
-        <w:spacing w:before="200" w:after="0"/>
+        <w:spacing w:before="400" w:after="0"/>
         <w:jc w:val="left"/>
       </w:pPr>
     </w:p>
     <w:p>
       <w:pPr>
-        <w:spacing w:before="40" w:after="280"/>
-        <w:jc w:val="right"/>
-      </w:pPr>
-      <w:r>
-        <w:rPr>
-          <w:rFonts w:ascii="Calibri" w:hAnsi="Calibri"/>
-          <w:b w:val="0"/>
-          <w:i w:val="0"/>
-          <w:sz w:val="22"/>
-        </w:rPr>
-        <w:t>Lorient, le 1er mars 2026</w:t>
-      </w:r>
-    </w:p>
-    <w:p>
-      <w:pPr>
-        <w:spacing w:before="0" w:after="280"/>
+        <w:spacing w:before="0" w:after="360"/>
       </w:pPr>
       <w:r>
         <w:rPr>
@@ -231,7 +304,7 @@
     </w:p>
     <w:p>
       <w:pPr>
-        <w:spacing w:before="0" w:after="240"/>
+        <w:spacing w:before="0" w:after="280"/>
         <w:jc w:val="left"/>
       </w:pPr>
       <w:r>
@@ -246,7 +319,7 @@
     </w:p>
     <w:p>
       <w:pPr>
-        <w:spacing w:before="0" w:after="200"/>
+        <w:spacing w:before="0" w:after="240"/>
         <w:ind w:firstLine="567"/>
         <w:jc w:val="both"/>
       </w:pPr>
@@ -262,7 +335,7 @@
     </w:p>
     <w:p>
       <w:pPr>
-        <w:spacing w:before="0" w:after="200"/>
+        <w:spacing w:before="0" w:after="240"/>
         <w:ind w:firstLine="567"/>
         <w:jc w:val="both"/>
       </w:pPr>
@@ -278,7 +351,7 @@
     </w:p>
     <w:p>
       <w:pPr>
-        <w:spacing w:before="0" w:after="200"/>
+        <w:spacing w:before="0" w:after="240"/>
         <w:ind w:firstLine="567"/>
         <w:jc w:val="both"/>
       </w:pPr>
@@ -294,7 +367,7 @@
     </w:p>
     <w:p>
       <w:pPr>
-        <w:spacing w:before="0" w:after="200"/>
+        <w:spacing w:before="0" w:after="240"/>
         <w:ind w:firstLine="567"/>
         <w:jc w:val="both"/>
       </w:pPr>
@@ -310,7 +383,7 @@
     </w:p>
     <w:p>
       <w:pPr>
-        <w:spacing w:before="0" w:after="200"/>
+        <w:spacing w:before="0" w:after="240"/>
         <w:jc w:val="both"/>
       </w:pPr>
       <w:r>
@@ -325,7 +398,7 @@
     </w:p>
     <w:p>
       <w:pPr>
-        <w:spacing w:before="0" w:after="600"/>
+        <w:spacing w:before="0" w:after="680"/>
         <w:jc w:val="both"/>
       </w:pPr>
       <w:r>
@@ -355,7 +428,7 @@
     </w:p>
     <w:sectPr>
       <w:pgSz w:w="12240" w:h="15840"/>
-      <w:pgMar w:top="1134" w:right="1417" w:bottom="1134" w:left="1417" w:header="720" w:footer="720" w:gutter="0"/>
+      <w:pgMar w:top="1020" w:right="1417" w:bottom="1020" w:left="1417" w:header="720" w:footer="720" w:gutter="0"/>
       <w:cols w:space="720"/>
       <w:docGrid w:linePitch="360"/>
     </w:sectPr>
@@ -727,7 +800,7 @@
     <w:qFormat/>
     <w:rsid w:val="00FC693F"/>
     <w:pPr>
-      <w:spacing w:before="0" w:after="0" w:line="280" w:lineRule="exact"/>
+      <w:spacing w:before="0" w:after="0"/>
     </w:pPr>
     <w:rPr>
       <w:rFonts w:ascii="Calibri" w:hAnsi="Calibri"/>

</xml_diff>

<commit_message>
Ajoute le logo ISFEC Bretagne dans l'en-tête de la lettre
- Recrée isfec_logo.png fidèlement avec Pillow (make_logo.py)
- Logo intégré en haut à droite via generate_letter.py
- Couleurs : "isfec" taupe chaud, "BRETAGNE" bleu, sphère teal

https://claude.ai/code/session_01D5AvaZw46FsvmkTyhrXuzZ
</commit_message>
<xml_diff>
--- a/Lettre_motivation_ISFEC_Arradon_M2E.docx
+++ b/Lettre_motivation_ISFEC_Arradon_M2E.docx
@@ -125,18 +125,42 @@
           </w:tcPr>
           <w:p>
             <w:pPr>
-              <w:spacing w:before="0"/>
+              <w:spacing w:before="0" w:after="0"/>
               <w:jc w:val="right"/>
             </w:pPr>
             <w:r>
-              <w:rPr>
-                <w:rFonts w:ascii="Calibri" w:hAnsi="Calibri"/>
-                <w:b w:val="0"/>
-                <w:i/>
-                <w:color w:val="BBBBBB"/>
-                <w:sz w:val="18"/>
-              </w:rPr>
-              <w:t>[ Logo ISFEC Bretagne ]</w:t>
+              <w:drawing>
+                <wp:inline xmlns:a="http://schemas.openxmlformats.org/drawingml/2006/main" xmlns:pic="http://schemas.openxmlformats.org/drawingml/2006/picture">
+                  <wp:extent cx="1620000" cy="453600"/>
+                  <wp:docPr id="1" name="Picture 1"/>
+                  <wp:cNvGraphicFramePr>
+                    <a:graphicFrameLocks noChangeAspect="1"/>
+                  </wp:cNvGraphicFramePr>
+                  <a:graphic>
+                    <a:graphicData uri="http://schemas.openxmlformats.org/drawingml/2006/picture">
+                      <pic:pic>
+                        <pic:nvPicPr>
+                          <pic:cNvPr id="0" name="isfec_logo.png"/>
+                          <pic:cNvPicPr/>
+                        </pic:nvPicPr>
+                        <pic:blipFill>
+                          <a:blip r:embed="rId9"/>
+                          <a:stretch>
+                            <a:fillRect/>
+                          </a:stretch>
+                        </pic:blipFill>
+                        <pic:spPr>
+                          <a:xfrm>
+                            <a:off x="0" y="0"/>
+                            <a:ext cx="1620000" cy="453600"/>
+                          </a:xfrm>
+                          <a:prstGeom prst="rect"/>
+                        </pic:spPr>
+                      </pic:pic>
+                    </a:graphicData>
+                  </a:graphic>
+                </wp:inline>
+              </w:drawing>
             </w:r>
           </w:p>
         </w:tc>

</xml_diff>

<commit_message>
Refonte complète : noir et blanc, simple, une page
- Suppression couleurs et logo
- En-tête : expéditrice gauche / destinataire droite
- Dernière ligne expéditrice alignée avec 1ère ligne destinataire
- Espacement réduit pour tenir sur une seule page

https://claude.ai/code/session_01D5AvaZw46FsvmkTyhrXuzZ
</commit_message>
<xml_diff>
--- a/Lettre_motivation_ISFEC_Arradon_M2E.docx
+++ b/Lettre_motivation_ISFEC_Arradon_M2E.docx
@@ -31,27 +31,11 @@
               <w:insideV w:val="none" w:sz="0" w:space="0" w:color="auto"/>
             </w:tcBorders>
             <w:vAlign w:val="top"/>
-            <w:tcW w:w="5670" w:type="dxa"/>
+            <w:tcW w:w="4536" w:type="dxa"/>
           </w:tcPr>
           <w:p>
             <w:pPr>
-              <w:spacing w:before="0" w:after="100"/>
-              <w:jc w:val="left"/>
-            </w:pPr>
-            <w:r>
-              <w:rPr>
-                <w:rFonts w:ascii="Calibri" w:hAnsi="Calibri"/>
-                <w:b/>
-                <w:i w:val="0"/>
-                <w:color w:val="1B548C"/>
-                <w:sz w:val="30"/>
-              </w:rPr>
-              <w:t>Louiza HADID</w:t>
-            </w:r>
-          </w:p>
-          <w:p>
-            <w:pPr>
-              <w:spacing w:before="0" w:after="20"/>
+              <w:spacing w:before="0" w:after="40"/>
               <w:jc w:val="left"/>
             </w:pPr>
             <w:r>
@@ -59,14 +43,15 @@
                 <w:rFonts w:ascii="Calibri" w:hAnsi="Calibri"/>
                 <w:b w:val="0"/>
                 <w:i w:val="0"/>
-                <w:sz w:val="20"/>
+                <w:color w:val="000000"/>
+                <w:sz w:val="22"/>
               </w:rPr>
-              <w:t>3 rue de Ventspils</w:t>
+              <w:t>Louiza Hadid</w:t>
             </w:r>
           </w:p>
           <w:p>
             <w:pPr>
-              <w:spacing w:before="0" w:after="20"/>
+              <w:spacing w:before="0" w:after="40"/>
               <w:jc w:val="left"/>
             </w:pPr>
             <w:r>
@@ -74,14 +59,15 @@
                 <w:rFonts w:ascii="Calibri" w:hAnsi="Calibri"/>
                 <w:b w:val="0"/>
                 <w:i w:val="0"/>
-                <w:sz w:val="20"/>
+                <w:color w:val="000000"/>
+                <w:sz w:val="22"/>
               </w:rPr>
-              <w:t>56100 Lorient</w:t>
+              <w:t>06-50-37-56-47</w:t>
             </w:r>
           </w:p>
           <w:p>
             <w:pPr>
-              <w:spacing w:before="0" w:after="20"/>
+              <w:spacing w:before="0" w:after="40"/>
               <w:jc w:val="left"/>
             </w:pPr>
             <w:r>
@@ -89,14 +75,15 @@
                 <w:rFonts w:ascii="Calibri" w:hAnsi="Calibri"/>
                 <w:b w:val="0"/>
                 <w:i w:val="0"/>
-                <w:sz w:val="20"/>
+                <w:color w:val="000000"/>
+                <w:sz w:val="22"/>
               </w:rPr>
-              <w:t>(+33) 6 50 37 56 47</w:t>
+              <w:t>louizahdd@gmail.com</w:t>
             </w:r>
           </w:p>
           <w:p>
             <w:pPr>
-              <w:spacing w:before="0" w:after="0"/>
+              <w:spacing w:before="0" w:after="40"/>
               <w:jc w:val="left"/>
             </w:pPr>
             <w:r>
@@ -104,9 +91,26 @@
                 <w:rFonts w:ascii="Calibri" w:hAnsi="Calibri"/>
                 <w:b w:val="0"/>
                 <w:i w:val="0"/>
-                <w:sz w:val="20"/>
+                <w:color w:val="000000"/>
+                <w:sz w:val="22"/>
               </w:rPr>
-              <w:t>louizahdd@gmail.com</w:t>
+              <w:t>3 rue de Ventspils</w:t>
+            </w:r>
+          </w:p>
+          <w:p>
+            <w:pPr>
+              <w:spacing w:before="0" w:after="40"/>
+              <w:jc w:val="left"/>
+            </w:pPr>
+            <w:r>
+              <w:rPr>
+                <w:rFonts w:ascii="Calibri" w:hAnsi="Calibri"/>
+                <w:b w:val="0"/>
+                <w:i w:val="0"/>
+                <w:color w:val="000000"/>
+                <w:sz w:val="22"/>
+              </w:rPr>
+              <w:t>56100 Lorient</w:t>
             </w:r>
           </w:p>
         </w:tc>
@@ -121,100 +125,19 @@
               <w:insideV w:val="none" w:sz="0" w:space="0" w:color="auto"/>
             </w:tcBorders>
             <w:vAlign w:val="top"/>
-            <w:tcW w:w="3402" w:type="dxa"/>
+            <w:tcW w:w="4536" w:type="dxa"/>
           </w:tcPr>
           <w:p>
             <w:pPr>
-              <w:spacing w:before="0" w:after="0"/>
+              <w:spacing w:before="1040" w:after="40"/>
               <w:jc w:val="right"/>
-            </w:pPr>
-            <w:r>
-              <w:drawing>
-                <wp:inline xmlns:a="http://schemas.openxmlformats.org/drawingml/2006/main" xmlns:pic="http://schemas.openxmlformats.org/drawingml/2006/picture">
-                  <wp:extent cx="1620000" cy="453600"/>
-                  <wp:docPr id="1" name="Picture 1"/>
-                  <wp:cNvGraphicFramePr>
-                    <a:graphicFrameLocks noChangeAspect="1"/>
-                  </wp:cNvGraphicFramePr>
-                  <a:graphic>
-                    <a:graphicData uri="http://schemas.openxmlformats.org/drawingml/2006/picture">
-                      <pic:pic>
-                        <pic:nvPicPr>
-                          <pic:cNvPr id="0" name="isfec_logo.png"/>
-                          <pic:cNvPicPr/>
-                        </pic:nvPicPr>
-                        <pic:blipFill>
-                          <a:blip r:embed="rId9"/>
-                          <a:stretch>
-                            <a:fillRect/>
-                          </a:stretch>
-                        </pic:blipFill>
-                        <pic:spPr>
-                          <a:xfrm>
-                            <a:off x="0" y="0"/>
-                            <a:ext cx="1620000" cy="453600"/>
-                          </a:xfrm>
-                          <a:prstGeom prst="rect"/>
-                        </pic:spPr>
-                      </pic:pic>
-                    </a:graphicData>
-                  </a:graphic>
-                </wp:inline>
-              </w:drawing>
-            </w:r>
-          </w:p>
-        </w:tc>
-      </w:tr>
-    </w:tbl>
-    <w:p>
-      <w:pPr>
-        <w:spacing w:before="320" w:after="320"/>
-        <w:pBdr>
-          <w:bottom w:val="single" w:sz="6" w:space="1" w:color="1B548C"/>
-        </w:pBdr>
-      </w:pPr>
-    </w:p>
-    <w:tbl>
-      <w:tblPr>
-        <w:tblW w:type="auto" w:w="0"/>
-        <w:tblLook w:firstColumn="1" w:firstRow="1" w:lastColumn="0" w:lastRow="0" w:noHBand="0" w:noVBand="1" w:val="04A0"/>
-        <w:tblBorders>
-          <w:top w:val="none" w:sz="0" w:space="0" w:color="auto"/>
-          <w:left w:val="none" w:sz="0" w:space="0" w:color="auto"/>
-          <w:bottom w:val="none" w:sz="0" w:space="0" w:color="auto"/>
-          <w:right w:val="none" w:sz="0" w:space="0" w:color="auto"/>
-          <w:insideH w:val="none" w:sz="0" w:space="0" w:color="auto"/>
-          <w:insideV w:val="none" w:sz="0" w:space="0" w:color="auto"/>
-        </w:tblBorders>
-      </w:tblPr>
-      <w:tblGrid>
-        <w:gridCol w:w="4703"/>
-        <w:gridCol w:w="4703"/>
-      </w:tblGrid>
-      <w:tr>
-        <w:tc>
-          <w:tcPr>
-            <w:tcBorders>
-              <w:top w:val="none" w:sz="0" w:space="0" w:color="auto"/>
-              <w:left w:val="none" w:sz="0" w:space="0" w:color="auto"/>
-              <w:bottom w:val="none" w:sz="0" w:space="0" w:color="auto"/>
-              <w:right w:val="none" w:sz="0" w:space="0" w:color="auto"/>
-              <w:insideH w:val="none" w:sz="0" w:space="0" w:color="auto"/>
-              <w:insideV w:val="none" w:sz="0" w:space="0" w:color="auto"/>
-            </w:tcBorders>
-            <w:vAlign w:val="top"/>
-            <w:tcW w:w="5386" w:type="dxa"/>
-          </w:tcPr>
-          <w:p>
-            <w:pPr>
-              <w:spacing w:before="0" w:after="40"/>
-              <w:jc w:val="left"/>
             </w:pPr>
             <w:r>
               <w:rPr>
                 <w:rFonts w:ascii="Calibri" w:hAnsi="Calibri"/>
-                <w:b/>
+                <w:b w:val="0"/>
                 <w:i w:val="0"/>
+                <w:color w:val="000000"/>
                 <w:sz w:val="22"/>
               </w:rPr>
               <w:t>ISFEC Bretagne</w:t>
@@ -223,13 +146,14 @@
           <w:p>
             <w:pPr>
               <w:spacing w:before="0" w:after="40"/>
-              <w:jc w:val="left"/>
+              <w:jc w:val="right"/>
             </w:pPr>
             <w:r>
               <w:rPr>
                 <w:rFonts w:ascii="Calibri" w:hAnsi="Calibri"/>
                 <w:b w:val="0"/>
                 <w:i w:val="0"/>
+                <w:color w:val="000000"/>
                 <w:sz w:val="22"/>
               </w:rPr>
               <w:t>Site d'Arradon</w:t>
@@ -238,13 +162,14 @@
           <w:p>
             <w:pPr>
               <w:spacing w:before="0" w:after="40"/>
-              <w:jc w:val="left"/>
+              <w:jc w:val="right"/>
             </w:pPr>
             <w:r>
               <w:rPr>
                 <w:rFonts w:ascii="Calibri" w:hAnsi="Calibri"/>
                 <w:b w:val="0"/>
                 <w:i w:val="0"/>
+                <w:color w:val="000000"/>
                 <w:sz w:val="22"/>
               </w:rPr>
               <w:t>3 allée des Fougères, BP 25</w:t>
@@ -252,36 +177,7 @@
           </w:p>
           <w:p>
             <w:pPr>
-              <w:spacing w:before="0" w:after="0"/>
-              <w:jc w:val="left"/>
-            </w:pPr>
-            <w:r>
-              <w:rPr>
-                <w:rFonts w:ascii="Calibri" w:hAnsi="Calibri"/>
-                <w:b w:val="0"/>
-                <w:i w:val="0"/>
-                <w:sz w:val="22"/>
-              </w:rPr>
-              <w:t>56610 Arradon</w:t>
-            </w:r>
-          </w:p>
-        </w:tc>
-        <w:tc>
-          <w:tcPr>
-            <w:tcBorders>
-              <w:top w:val="none" w:sz="0" w:space="0" w:color="auto"/>
-              <w:left w:val="none" w:sz="0" w:space="0" w:color="auto"/>
-              <w:bottom w:val="none" w:sz="0" w:space="0" w:color="auto"/>
-              <w:right w:val="none" w:sz="0" w:space="0" w:color="auto"/>
-              <w:insideH w:val="none" w:sz="0" w:space="0" w:color="auto"/>
-              <w:insideV w:val="none" w:sz="0" w:space="0" w:color="auto"/>
-            </w:tcBorders>
-            <w:vAlign w:val="top"/>
-            <w:tcW w:w="3685" w:type="dxa"/>
-          </w:tcPr>
-          <w:p>
-            <w:pPr>
-              <w:spacing w:before="0" w:after="0"/>
+              <w:spacing w:before="0" w:after="40"/>
               <w:jc w:val="right"/>
             </w:pPr>
             <w:r>
@@ -289,9 +185,10 @@
                 <w:rFonts w:ascii="Calibri" w:hAnsi="Calibri"/>
                 <w:b w:val="0"/>
                 <w:i w:val="0"/>
+                <w:color w:val="000000"/>
                 <w:sz w:val="22"/>
               </w:rPr>
-              <w:t>Lorient, le 1er mars 2026</w:t>
+              <w:t>56610 Arradon</w:t>
             </w:r>
           </w:p>
         </w:tc>
@@ -300,27 +197,39 @@
     <w:p>
       <w:pPr>
         <w:spacing w:before="400" w:after="0"/>
-        <w:jc w:val="left"/>
+        <w:jc w:val="right"/>
       </w:pPr>
+      <w:r>
+        <w:rPr>
+          <w:rFonts w:ascii="Calibri" w:hAnsi="Calibri"/>
+          <w:b w:val="0"/>
+          <w:i w:val="0"/>
+          <w:color w:val="000000"/>
+          <w:sz w:val="22"/>
+        </w:rPr>
+        <w:t>Lorient, le 1er mars 2026</w:t>
+      </w:r>
     </w:p>
     <w:p>
       <w:pPr>
-        <w:spacing w:before="0" w:after="360"/>
+        <w:spacing w:before="400" w:after="280"/>
       </w:pPr>
       <w:r>
         <w:rPr>
           <w:rFonts w:ascii="Calibri" w:hAnsi="Calibri"/>
           <w:b/>
           <w:i w:val="0"/>
+          <w:color w:val="000000"/>
           <w:sz w:val="22"/>
         </w:rPr>
-        <w:t xml:space="preserve">Objet : </w:t>
+        <w:t xml:space="preserve">Objet : </w:t>
       </w:r>
       <w:r>
         <w:rPr>
           <w:rFonts w:ascii="Calibri" w:hAnsi="Calibri"/>
           <w:b/>
           <w:i w:val="0"/>
+          <w:color w:val="000000"/>
           <w:sz w:val="22"/>
         </w:rPr>
         <w:t>Candidature au Master MEEF – Mention 1er degré</w:t>
@@ -328,14 +237,14 @@
     </w:p>
     <w:p>
       <w:pPr>
-        <w:spacing w:before="0" w:after="280"/>
-        <w:jc w:val="left"/>
+        <w:spacing w:before="0" w:after="240"/>
       </w:pPr>
       <w:r>
         <w:rPr>
           <w:rFonts w:ascii="Calibri" w:hAnsi="Calibri"/>
           <w:b w:val="0"/>
           <w:i w:val="0"/>
+          <w:color w:val="000000"/>
           <w:sz w:val="22"/>
         </w:rPr>
         <w:t>Madame, Monsieur,</w:t>
@@ -343,7 +252,7 @@
     </w:p>
     <w:p>
       <w:pPr>
-        <w:spacing w:before="0" w:after="240"/>
+        <w:spacing w:before="0" w:after="160"/>
         <w:ind w:firstLine="567"/>
         <w:jc w:val="both"/>
       </w:pPr>
@@ -352,14 +261,15 @@
           <w:rFonts w:ascii="Calibri" w:hAnsi="Calibri"/>
           <w:b w:val="0"/>
           <w:i w:val="0"/>
+          <w:color w:val="000000"/>
           <w:sz w:val="22"/>
         </w:rPr>
-        <w:t>C'est avec un vif intérêt que je vous adresse ma candidature pour le Master MEEF, mention 1er degré, proposé par l'ISFEC Bretagne sur son site d'Arradon. Affilié à l'Université Catholique de l'Ouest pour la délivrance du diplôme, cet établissement s'inscrit pleinement dans le réseau national des ISFEC et se distingue par un accompagnement de proximité au sein de promotions à effectifs réduits. C'est ce cadre de formation, à la fois rigoureux et bienveillant, ancré dans les valeurs de l'enseignement catholique, qui en fait mon premier choix dans la perspective de préparer le CRPE et d'enseigner dans le premier degré.</w:t>
+        <w:t>C'est avec un vif intérêt que je vous adresse ma candidature pour le Master MEEF, mention 1er degré, proposé par l'ISFEC Bretagne sur son site d'Arradon. Affilié à l'Université Catholique de l'Ouest, cet établissement se distingue par un accompagnement de proximité au sein de promotions à effectifs réduits. C'est ce cadre de formation, à la fois rigoureux et bienveillant, ancré dans les valeurs de l'enseignement catholique, qui en fait mon premier choix dans la perspective de préparer le CRPE et d'enseigner dans le premier degré.</w:t>
       </w:r>
     </w:p>
     <w:p>
       <w:pPr>
-        <w:spacing w:before="0" w:after="240"/>
+        <w:spacing w:before="0" w:after="160"/>
         <w:ind w:firstLine="567"/>
         <w:jc w:val="both"/>
       </w:pPr>
@@ -368,6 +278,7 @@
           <w:rFonts w:ascii="Calibri" w:hAnsi="Calibri"/>
           <w:b w:val="0"/>
           <w:i w:val="0"/>
+          <w:color w:val="000000"/>
           <w:sz w:val="22"/>
         </w:rPr>
         <w:t>Mon parcours en Sciences de l'éducation à l'Université Rennes 2 m'a permis de construire des bases solides en pédagogie, en psychologie du développement et en didactique. Ces apprentissages ont progressivement conforté ma conviction : c'est dans l'enseignement du premier degré que je veux m'investir sur le long terme. La préparation au CRPE intégrée à votre Master constitue pour moi une étape décisive pour accéder à ce métier dans les meilleures conditions.</w:t>
@@ -375,7 +286,7 @@
     </w:p>
     <w:p>
       <w:pPr>
-        <w:spacing w:before="0" w:after="240"/>
+        <w:spacing w:before="0" w:after="160"/>
         <w:ind w:firstLine="567"/>
         <w:jc w:val="both"/>
       </w:pPr>
@@ -384,14 +295,15 @@
           <w:rFonts w:ascii="Calibri" w:hAnsi="Calibri"/>
           <w:b w:val="0"/>
           <w:i w:val="0"/>
+          <w:color w:val="000000"/>
           <w:sz w:val="22"/>
         </w:rPr>
-        <w:t>Sur le plan pratique, mes expériences au contact des enfants ont renforcé cette orientation. En tant qu'animatrice périscolaire dans le quartier prioritaire de Villejean à Rennes, j'ai appris à adapter mon approche à des publics diversifiés et à faire preuve de patience et de bienveillance dans des situations parfois complexes. J'ai également exercé comme tutrice de français auprès d'apprenants étrangers, ce qui m'a amenée à travailler la reformulation, la différenciation pédagogique et l'écoute active, des compétences directement transposables dans l'exercice du métier d'enseignante.</w:t>
+        <w:t>Sur le plan pratique, mes expériences au contact des enfants ont renforcé cette orientation. En tant qu'animatrice périscolaire dans le quartier prioritaire de Villejean à Rennes, j'ai appris à adapter mon approche à des publics diversifiés et à faire preuve de patience et de bienveillance. J'ai également exercé comme tutrice de français auprès d'apprenants étrangers, développant ainsi la reformulation, la différenciation pédagogique et l'écoute active — des compétences directement transposables dans l'exercice du métier d'enseignante.</w:t>
       </w:r>
     </w:p>
     <w:p>
       <w:pPr>
-        <w:spacing w:before="0" w:after="240"/>
+        <w:spacing w:before="0" w:after="0"/>
         <w:ind w:firstLine="567"/>
         <w:jc w:val="both"/>
       </w:pPr>
@@ -400,21 +312,22 @@
           <w:rFonts w:ascii="Calibri" w:hAnsi="Calibri"/>
           <w:b w:val="0"/>
           <w:i w:val="0"/>
+          <w:color w:val="000000"/>
           <w:sz w:val="22"/>
         </w:rPr>
-        <w:t>Ces expériences m'ont confirmé que l'enseignement va bien au-delà de la transmission de savoirs : il s'agit avant tout d'accompagner chaque élève dans son développement, de l'encourager et d'adapter sa pratique à ses besoins. C'est dans cette perspective que je souhaite m'investir pleinement dans votre formation, convaincue que l'ISFEC d'Arradon m'offrira les outils théoriques et pratiques pour exercer ce métier avec rigueur et engagement.</w:t>
+        <w:t>Ces expériences m'ont confirmé que l'enseignement va bien au-delà de la transmission de savoirs : il s'agit avant tout d'accompagner chaque élève dans son développement. C'est dans cette perspective que je souhaite m'investir pleinement dans votre formation, convaincue que l'ISFEC d'Arradon m'offrira les outils théoriques et pratiques pour exercer ce métier avec rigueur et engagement.</w:t>
       </w:r>
     </w:p>
     <w:p>
       <w:pPr>
-        <w:spacing w:before="0" w:after="240"/>
-        <w:jc w:val="both"/>
+        <w:spacing w:before="240" w:after="160"/>
       </w:pPr>
       <w:r>
         <w:rPr>
           <w:rFonts w:ascii="Calibri" w:hAnsi="Calibri"/>
           <w:b w:val="0"/>
           <w:i w:val="0"/>
+          <w:color w:val="000000"/>
           <w:sz w:val="22"/>
         </w:rPr>
         <w:t>Dans l'attente d'une réponse favorable, je me tiens à votre disposition pour tout entretien ou renseignement complémentaire.</w:t>
@@ -422,14 +335,14 @@
     </w:p>
     <w:p>
       <w:pPr>
-        <w:spacing w:before="0" w:after="680"/>
-        <w:jc w:val="both"/>
+        <w:spacing w:before="0" w:after="560"/>
       </w:pPr>
       <w:r>
         <w:rPr>
           <w:rFonts w:ascii="Calibri" w:hAnsi="Calibri"/>
           <w:b w:val="0"/>
           <w:i w:val="0"/>
+          <w:color w:val="000000"/>
           <w:sz w:val="22"/>
         </w:rPr>
         <w:t>Veuillez recevoir, Madame, Monsieur, l'expression de mes salutations distinguées.</w:t>
@@ -445,6 +358,7 @@
           <w:rFonts w:ascii="Calibri" w:hAnsi="Calibri"/>
           <w:b/>
           <w:i w:val="0"/>
+          <w:color w:val="000000"/>
           <w:sz w:val="22"/>
         </w:rPr>
         <w:t>Louiza Hadid</w:t>
@@ -452,7 +366,7 @@
     </w:p>
     <w:sectPr>
       <w:pgSz w:w="12240" w:h="15840"/>
-      <w:pgMar w:top="1020" w:right="1417" w:bottom="1020" w:left="1417" w:header="720" w:footer="720" w:gutter="0"/>
+      <w:pgMar w:top="1247" w:right="1417" w:bottom="1134" w:left="1417" w:header="720" w:footer="720" w:gutter="0"/>
       <w:cols w:space="720"/>
       <w:docGrid w:linePitch="360"/>
     </w:sectPr>

</xml_diff>

<commit_message>
Réécriture P1 et P2 : ton naturel, centré sur la candidature
https://claude.ai/code/session_01D5AvaZw46FsvmkTyhrXuzZ
</commit_message>
<xml_diff>
--- a/Lettre_motivation_ISFEC_Arradon_M2E.docx
+++ b/Lettre_motivation_ISFEC_Arradon_M2E.docx
@@ -264,7 +264,7 @@
           <w:color w:val="000000"/>
           <w:sz w:val="22"/>
         </w:rPr>
-        <w:t>C'est avec un vif intérêt que je vous adresse ma candidature pour le Master MEEF, mention 1er degré, proposé par l'ISFEC Bretagne sur son site d'Arradon. Affilié à l'Université Catholique de l'Ouest, cet établissement se distingue par un accompagnement de proximité au sein de promotions à effectifs réduits. C'est ce cadre de formation, à la fois rigoureux et bienveillant, ancré dans les valeurs de l'enseignement catholique, qui en fait mon premier choix dans la perspective de préparer le CRPE et d'enseigner dans le premier degré.</w:t>
+        <w:t>En fin de licence de Sciences de l'éducation à Rennes 2, je candidate au Master MEEF mention 1er degré pour préparer le CRPE et devenir enseignante du premier degré. J'ai choisi l'ISFEC d'Arradon pour ses promotions à taille humaine — un cadre qui me semble plus adapté à cette année de préparation — et parce que les valeurs portées par l'enseignement catholique sont proches des miennes.</w:t>
       </w:r>
     </w:p>
     <w:p>
@@ -281,7 +281,7 @@
           <w:color w:val="000000"/>
           <w:sz w:val="22"/>
         </w:rPr>
-        <w:t>Mon parcours en Sciences de l'éducation à l'Université Rennes 2 m'a permis de construire des bases solides en pédagogie, en psychologie du développement et en didactique. Ces apprentissages ont progressivement conforté ma conviction : c'est dans l'enseignement du premier degré que je veux m'investir sur le long terme. La préparation au CRPE intégrée à votre Master constitue pour moi une étape décisive pour accéder à ce métier dans les meilleures conditions.</w:t>
+        <w:t>Ces trois années à Rennes 2 m'ont permis de construire des bases solides en pédagogie, en psychologie du développement et en didactique. Elles ont progressivement conforté ma conviction : c'est dans l'enseignement du premier degré que je veux m'investir. La préparation au CRPE intégrée à votre Master constitue une étape décisive pour y accéder dans les meilleures conditions.</w:t>
       </w:r>
     </w:p>
     <w:p>

</xml_diff>

<commit_message>
Corrections P1 : diplômée (pas en fin de licence), suppression des tirets cadratins
https://claude.ai/code/session_01D5AvaZw46FsvmkTyhrXuzZ
</commit_message>
<xml_diff>
--- a/Lettre_motivation_ISFEC_Arradon_M2E.docx
+++ b/Lettre_motivation_ISFEC_Arradon_M2E.docx
@@ -264,7 +264,7 @@
           <w:color w:val="000000"/>
           <w:sz w:val="22"/>
         </w:rPr>
-        <w:t>En fin de licence de Sciences de l'éducation à Rennes 2, je candidate au Master MEEF mention 1er degré pour préparer le CRPE et devenir enseignante du premier degré. J'ai choisi l'ISFEC d'Arradon pour ses promotions à taille humaine — un cadre qui me semble plus adapté à cette année de préparation — et parce que les valeurs portées par l'enseignement catholique sont proches des miennes.</w:t>
+        <w:t>Diplômée d'une licence de Sciences de l'éducation à Rennes 2, je candidate au Master MEEF mention 1er degré pour préparer le CRPE et devenir enseignante du premier degré. J'ai choisi l'ISFEC d'Arradon pour ses promotions à taille humaine, un cadre qui me semble plus propice à cette préparation, et pour des valeurs qui sont aussi les miennes.</w:t>
       </w:r>
     </w:p>
     <w:p>
@@ -298,7 +298,7 @@
           <w:color w:val="000000"/>
           <w:sz w:val="22"/>
         </w:rPr>
-        <w:t>Sur le plan pratique, mes expériences au contact des enfants ont renforcé cette orientation. En tant qu'animatrice périscolaire dans le quartier prioritaire de Villejean à Rennes, j'ai appris à adapter mon approche à des publics diversifiés et à faire preuve de patience et de bienveillance. J'ai également exercé comme tutrice de français auprès d'apprenants étrangers, développant ainsi la reformulation, la différenciation pédagogique et l'écoute active — des compétences directement transposables dans l'exercice du métier d'enseignante.</w:t>
+        <w:t>Sur le plan pratique, mes expériences au contact des enfants ont renforcé cette orientation. En tant qu'animatrice périscolaire dans le quartier prioritaire de Villejean à Rennes, j'ai appris à adapter mon approche à des publics diversifiés et à faire preuve de patience et de bienveillance. J'ai également exercé comme tutrice de français auprès d'apprenants étrangers, développant ainsi la reformulation, la différenciation pédagogique et l'écoute active, des compétences directement transposables dans l'exercice du métier d'enseignante.</w:t>
       </w:r>
     </w:p>
     <w:p>

</xml_diff>